<commit_message>
fix(backend,client): informe pericial — firma junta, caracteres inválidos, 'Android Android' y prolijidad de formato
- SafeText (Common/SafeText.cs): quita caracteres inválidos en XML (U+FFFE/FFFF,
  surrogates sueltos, C0) y controles bidi al guardar (caso, perfil, branding,
  catálogos, auditoría) y en el generador; cleanText del cliente como espejo.
- Firma con keep-with-next/keep-lines; OsLabel idempotente; portada en una
  página (fuente por tramos) y encabezado ≤ 2 líneas; imágenes sin ampliar más
  allá de 96 dpi; 'siendo las horas'; 'No informado'; sin 'Se constató:' fijo;
  sangrías unificadas en 4 cm; idioma es-AR; plantillas v4/v6 regeneradas.

HU #62 — docs/hu-informe-formato-fixes.md

Co-Authored-By: Claude Opus 5.5 <noreply@anthropic.com>
</commit_message>
<xml_diff>
--- a/server/src/Factum.Backend/Templates/plantilla_informe_v4.docx
+++ b/server/src/Factum.Backend/Templates/plantilla_informe_v4.docx
@@ -1009,7 +1009,7 @@
         <w:rPr>
           <w:rFonts w:ascii="Times New Roman" w:hAnsi="Times New Roman" w:eastAsia="Times New Roman" w:cs="Times New Roman"/>
         </w:rPr>
-        <w:t xml:space="preserve">, siendo horas </w:t>
+        <w:t xml:space="preserve">, siendo las </w:t>
       </w:r>
       <w:r>
         <w:rPr>
@@ -1021,7 +1021,7 @@
         <w:rPr>
           <w:rFonts w:ascii="Times New Roman" w:hAnsi="Times New Roman" w:eastAsia="Times New Roman" w:cs="Times New Roman"/>
         </w:rPr>
-        <w:t xml:space="preserve">, se procedió a la inspección técnica del dispositivo:</w:t>
+        <w:t xml:space="preserve"> horas, se procedió a la inspección técnica del dispositivo:</w:t>
       </w:r>
     </w:p>
     <w:p>
@@ -1892,10 +1892,12 @@
     <w:p>
       <w:pPr>
         <w:spacing w:after="0" w:line="360" w:lineRule="auto"/>
-        <w:jc w:val="both"/>
-        <w:rPr>
-          <w:rFonts w:ascii="Times New Roman" w:hAnsi="Times New Roman" w:eastAsia="Times New Roman" w:cs="Times New Roman"/>
-          <w:kern w:val="0"/>
+        <w:ind w:firstLine="2268"/>
+        <w:jc w:val="both"/>
+        <w:rPr>
+          <w:rFonts w:hint="default" w:ascii="Times New Roman" w:hAnsi="Times New Roman" w:eastAsia="Times New Roman" w:cs="Times New Roman"/>
+          <w:kern w:val="0"/>
+          <w:lang w:val="en-US"/>
           <w14:ligatures w14:val="none"/>
         </w:rPr>
       </w:pPr>
@@ -1956,45 +1958,6 @@
           <w14:ligatures w14:val="none"/>
         </w:rPr>
         <w:t>RESULTADOS</w:t>
-      </w:r>
-    </w:p>
-    <w:p>
-      <w:pPr>
-        <w:spacing w:after="0" w:line="360" w:lineRule="auto"/>
-        <w:ind w:firstLine="2268"/>
-        <w:jc w:val="both"/>
-        <w:rPr>
-          <w:rFonts w:ascii="Times New Roman" w:hAnsi="Times New Roman" w:eastAsia="Times New Roman" w:cs="Times New Roman"/>
-          <w:kern w:val="0"/>
-          <w:lang w:val="en-US"/>
-          <w14:ligatures w14:val="none"/>
-        </w:rPr>
-      </w:pPr>
-      <w:r>
-        <w:rPr>
-          <w:rFonts w:ascii="Times New Roman" w:hAnsi="Times New Roman" w:eastAsia="Times New Roman" w:cs="Times New Roman"/>
-          <w:kern w:val="0"/>
-          <w:lang w:val="en-US"/>
-          <w14:ligatures w14:val="none"/>
-        </w:rPr>
-        <w:t xml:space="preserve">Se </w:t>
-      </w:r>
-      <w:r>
-        <w:rPr>
-          <w:rFonts w:ascii="Times New Roman" w:hAnsi="Times New Roman" w:eastAsia="Times New Roman" w:cs="Times New Roman"/>
-          <w:kern w:val="0"/>
-          <w14:ligatures w14:val="none"/>
-        </w:rPr>
-        <w:t>constató</w:t>
-      </w:r>
-      <w:r>
-        <w:rPr>
-          <w:rFonts w:ascii="Times New Roman" w:hAnsi="Times New Roman" w:eastAsia="Times New Roman" w:cs="Times New Roman"/>
-          <w:kern w:val="0"/>
-          <w:lang w:val="en-US"/>
-          <w14:ligatures w14:val="none"/>
-        </w:rPr>
-        <w:t>:</w:t>
       </w:r>
     </w:p>
     <w:p>
@@ -2148,11 +2111,13 @@
     <w:p>
       <w:pPr>
         <w:spacing w:after="0" w:line="360" w:lineRule="auto"/>
-        <w:ind w:left="360"/>
+        <w:ind w:firstLine="2268"/>
         <w:jc w:val="both"/>
         <w:rPr>
           <w:rFonts w:hint="default" w:ascii="Times New Roman" w:hAnsi="Times New Roman" w:eastAsia="Times New Roman" w:cs="Times New Roman"/>
+          <w:kern w:val="0"/>
           <w:lang w:val="en-US"/>
+          <w14:ligatures w14:val="none"/>
         </w:rPr>
       </w:pPr>
       <w:r>
@@ -2216,10 +2181,13 @@
     <w:p>
       <w:pPr>
         <w:spacing w:after="0" w:line="360" w:lineRule="auto"/>
+        <w:ind w:firstLine="2268"/>
         <w:jc w:val="both"/>
         <w:rPr>
           <w:rFonts w:hint="default" w:ascii="Times New Roman" w:hAnsi="Times New Roman" w:eastAsia="Times New Roman" w:cs="Times New Roman"/>
+          <w:kern w:val="0"/>
           <w:lang w:val="en-US"/>
+          <w14:ligatures w14:val="none"/>
         </w:rPr>
       </w:pPr>
       <w:r>

</xml_diff>

<commit_message>
feat(backend,agent,client): sellado de tiempo RFC 3161 de la evidencia, el ZIP y el informe
- backend: cliente RFC 3161 (System.Security.Cryptography.Pkcs 10.0.13) con nonce, validación de hash/estado y fallback entre URLs; colección case_timestamps; cola de reintentos con backoff, tope y leases; eventos de trazabilidad; bloque selloTiempo y líneas de sello en la plantilla del informe con constancia 'sin sello'.
- Tatana: copia de los .tsr y LEEME-verificacion.txt a sellos/ en la carpeta del caso, sin tocar el ZIP.
- client: estado del sello por archivo en la bandeja, bloque 'Sello de tiempo' en resultado y detalle, descarga de sellos, etapa combinada al generar.
- deploy: sellado apagado por defecto en nube y Windows (FACTUM_SELLADO_URLS vacío) hasta elegir la autoridad; FreeTSA + DigiCert en desarrollo.

Closes #78

Co-Authored-By: Claude Opus 5.5 <noreply@anthropic.com>
</commit_message>
<xml_diff>
--- a/server/src/Factum.Backend/Templates/plantilla_informe_v4.docx
+++ b/server/src/Factum.Backend/Templates/plantilla_informe_v4.docx
@@ -1586,6 +1586,60 @@
         </w:tc>
       </w:tr>
     </w:tbl>
+    <w:p>
+      <w:pPr>
+        <w:spacing w:after="0" w:line="240" w:lineRule="auto"/>
+        <w:rPr>
+          <w:rFonts w:ascii="Times New Roman" w:hAnsi="Times New Roman" w:eastAsia="Times New Roman" w:cs="Times New Roman"/>
+        </w:rPr>
+      </w:pPr>
+      <w:r>
+        <w:rPr>
+          <w:rFonts w:ascii="Times New Roman" w:hAnsi="Times New Roman" w:eastAsia="Times New Roman" w:cs="Times New Roman"/>
+        </w:rPr>
+        <w:t>{#selloTiempo}</w:t>
+      </w:r>
+    </w:p>
+    <w:p>
+      <w:pPr>
+        <w:spacing w:after="0" w:line="240" w:lineRule="auto"/>
+      </w:pPr>
+    </w:p>
+    <w:p>
+      <w:pPr>
+        <w:spacing w:after="0" w:line="360" w:lineRule="auto"/>
+        <w:ind w:firstLine="2268"/>
+        <w:jc w:val="both"/>
+        <w:rPr>
+          <w:rFonts w:hint="default" w:ascii="Times New Roman" w:hAnsi="Times New Roman" w:eastAsia="Times New Roman" w:cs="Times New Roman"/>
+          <w:kern w:val="0"/>
+          <w:lang w:val="en-US"/>
+          <w14:ligatures w14:val="none"/>
+        </w:rPr>
+      </w:pPr>
+      <w:r>
+        <w:rPr>
+          <w:rFonts w:ascii="Times New Roman" w:hAnsi="Times New Roman" w:eastAsia="Times New Roman" w:cs="Times New Roman"/>
+          <w:kern w:val="0"/>
+          <w14:ligatures w14:val="none"/>
+        </w:rPr>
+        <w:t xml:space="preserve">{descripcionSelloTiempo}</w:t>
+      </w:r>
+    </w:p>
+    <w:p>
+      <w:pPr>
+        <w:spacing w:after="0" w:line="240" w:lineRule="auto"/>
+        <w:rPr>
+          <w:rFonts w:ascii="Times New Roman" w:hAnsi="Times New Roman" w:eastAsia="Times New Roman" w:cs="Times New Roman"/>
+        </w:rPr>
+      </w:pPr>
+      <w:r>
+        <w:rPr>
+          <w:rFonts w:ascii="Times New Roman" w:hAnsi="Times New Roman" w:eastAsia="Times New Roman" w:cs="Times New Roman"/>
+        </w:rPr>
+        <w:t>{/selloTiempo}</w:t>
+      </w:r>
+    </w:p>
     <w:p>
       <w:pPr>
         <w:spacing w:after="0" w:line="360" w:lineRule="auto"/>

</xml_diff>

<commit_message>
feat(agent,backend,client): ficha técnica automática del dispositivo y diferencia de reloj
- Tatana: lectura de solo lectura por ADB y pymobiledevice3 (serie/identificador, compilación, parche, kernel, operador/SIM, estado de arranque crudo, zona horaria, hora automática, wifi) con 'No disponible' y motivo; medición de reloj dispositivo↔PC con margen; capacidad device_details_v1 en /health.
- backend: ficha en el caso con saneo por clave, estimación PC↔servidor, segunda medición al generar, umbral de desfase configurable (60 s), trazabilidad sin SSID, bloque condicional fichaTecnica en la plantilla.
- client: ficha en el paso 2 y en el detalle, SSID al informe solo si el perito lo marca, 'Volver a leer' en borrador, avisos de desfase y de Tatana viejo.

Closes #79

Co-Authored-By: Claude Opus 5.5 <noreply@anthropic.com>
</commit_message>
<xml_diff>
--- a/server/src/Factum.Backend/Templates/plantilla_informe_v4.docx
+++ b/server/src/Factum.Backend/Templates/plantilla_informe_v4.docx
@@ -1189,6 +1189,426 @@
           <w:rFonts w:ascii="Times New Roman" w:hAnsi="Times New Roman" w:eastAsia="Times New Roman" w:cs="Times New Roman"/>
         </w:rPr>
         <w:t xml:space="preserve">{titularDispositivo}</w:t>
+      </w:r>
+    </w:p>
+    <w:p>
+      <w:pPr>
+        <w:spacing w:after="0" w:line="240" w:lineRule="auto"/>
+        <w:rPr>
+          <w:rFonts w:ascii="Times New Roman" w:hAnsi="Times New Roman" w:eastAsia="Times New Roman" w:cs="Times New Roman"/>
+        </w:rPr>
+      </w:pPr>
+      <w:r>
+        <w:rPr>
+          <w:rFonts w:ascii="Times New Roman" w:hAnsi="Times New Roman" w:eastAsia="Times New Roman" w:cs="Times New Roman"/>
+        </w:rPr>
+        <w:t>{#fichaTecnica}</w:t>
+      </w:r>
+    </w:p>
+    <w:p>
+      <w:pPr>
+        <w:spacing w:after="0" w:line="360" w:lineRule="auto"/>
+        <w:ind w:firstLine="2268"/>
+        <w:jc w:val="both"/>
+        <w:rPr>
+          <w:rFonts w:hint="default" w:ascii="Times New Roman" w:hAnsi="Times New Roman" w:eastAsia="Times New Roman" w:cs="Times New Roman"/>
+          <w:kern w:val="0"/>
+          <w:lang w:val="en-US"/>
+          <w14:ligatures w14:val="none"/>
+        </w:rPr>
+      </w:pPr>
+      <w:r>
+        <w:rPr>
+          <w:rFonts w:ascii="Times New Roman" w:hAnsi="Times New Roman" w:eastAsia="Times New Roman" w:cs="Times New Roman"/>
+        </w:rPr>
+        <w:t xml:space="preserve">Datos técnicos obtenidos automáticamente por Factum mediante consultas de solo lectura al dispositivo el </w:t>
+      </w:r>
+      <w:r>
+        <w:rPr>
+          <w:rFonts w:ascii="Times New Roman" w:hAnsi="Times New Roman" w:eastAsia="Times New Roman" w:cs="Times New Roman"/>
+        </w:rPr>
+        <w:t xml:space="preserve">{fechaFichaTecnica}</w:t>
+      </w:r>
+      <w:r>
+        <w:rPr>
+          <w:rFonts w:ascii="Times New Roman" w:hAnsi="Times New Roman" w:eastAsia="Times New Roman" w:cs="Times New Roman"/>
+        </w:rPr>
+        <w:t xml:space="preserve"> a las </w:t>
+      </w:r>
+      <w:r>
+        <w:rPr>
+          <w:rFonts w:ascii="Times New Roman" w:hAnsi="Times New Roman" w:eastAsia="Times New Roman" w:cs="Times New Roman"/>
+        </w:rPr>
+        <w:t xml:space="preserve">{horaFichaTecnica}</w:t>
+      </w:r>
+      <w:r>
+        <w:rPr>
+          <w:rFonts w:ascii="Times New Roman" w:hAnsi="Times New Roman" w:eastAsia="Times New Roman" w:cs="Times New Roman"/>
+        </w:rPr>
+        <w:t xml:space="preserve"> horas:</w:t>
+      </w:r>
+    </w:p>
+    <w:p>
+      <w:pPr>
+        <w:numPr>
+          <w:ilvl w:val="0"/>
+          <w:numId w:val="4"/>
+        </w:numPr>
+        <w:spacing w:after="0" w:line="360" w:lineRule="auto"/>
+        <w:jc w:val="both"/>
+        <w:rPr>
+          <w:rFonts w:ascii="Times New Roman" w:hAnsi="Times New Roman" w:eastAsia="Times New Roman" w:cs="Times New Roman"/>
+        </w:rPr>
+      </w:pPr>
+      <w:r>
+        <w:rPr>
+          <w:rFonts w:ascii="Times New Roman" w:hAnsi="Times New Roman" w:eastAsia="Times New Roman" w:cs="Times New Roman"/>
+          <w:b/>
+          <w:bCs/>
+        </w:rPr>
+        <w:t xml:space="preserve">Sistema operativo:</w:t>
+      </w:r>
+      <w:r>
+        <w:rPr>
+          <w:rFonts w:ascii="Times New Roman" w:hAnsi="Times New Roman" w:eastAsia="Times New Roman" w:cs="Times New Roman"/>
+        </w:rPr>
+        <w:t xml:space="preserve"> </w:t>
+      </w:r>
+      <w:r>
+        <w:rPr>
+          <w:rFonts w:ascii="Times New Roman" w:hAnsi="Times New Roman" w:eastAsia="Times New Roman" w:cs="Times New Roman"/>
+        </w:rPr>
+        <w:t xml:space="preserve">{fichaSistemaOperativo}</w:t>
+      </w:r>
+    </w:p>
+    <w:p>
+      <w:pPr>
+        <w:numPr>
+          <w:ilvl w:val="0"/>
+          <w:numId w:val="4"/>
+        </w:numPr>
+        <w:spacing w:after="0" w:line="360" w:lineRule="auto"/>
+        <w:jc w:val="both"/>
+        <w:rPr>
+          <w:rFonts w:ascii="Times New Roman" w:hAnsi="Times New Roman" w:eastAsia="Times New Roman" w:cs="Times New Roman"/>
+        </w:rPr>
+      </w:pPr>
+      <w:r>
+        <w:rPr>
+          <w:rFonts w:ascii="Times New Roman" w:hAnsi="Times New Roman" w:eastAsia="Times New Roman" w:cs="Times New Roman"/>
+          <w:b/>
+          <w:bCs/>
+        </w:rPr>
+        <w:t xml:space="preserve">Compilación:</w:t>
+      </w:r>
+      <w:r>
+        <w:rPr>
+          <w:rFonts w:ascii="Times New Roman" w:hAnsi="Times New Roman" w:eastAsia="Times New Roman" w:cs="Times New Roman"/>
+        </w:rPr>
+        <w:t xml:space="preserve"> </w:t>
+      </w:r>
+      <w:r>
+        <w:rPr>
+          <w:rFonts w:ascii="Times New Roman" w:hAnsi="Times New Roman" w:eastAsia="Times New Roman" w:cs="Times New Roman"/>
+        </w:rPr>
+        <w:t xml:space="preserve">{fichaCompilacion}</w:t>
+      </w:r>
+    </w:p>
+    <w:p>
+      <w:pPr>
+        <w:numPr>
+          <w:ilvl w:val="0"/>
+          <w:numId w:val="4"/>
+        </w:numPr>
+        <w:spacing w:after="0" w:line="360" w:lineRule="auto"/>
+        <w:jc w:val="both"/>
+        <w:rPr>
+          <w:rFonts w:ascii="Times New Roman" w:hAnsi="Times New Roman" w:eastAsia="Times New Roman" w:cs="Times New Roman"/>
+        </w:rPr>
+      </w:pPr>
+      <w:r>
+        <w:rPr>
+          <w:rFonts w:ascii="Times New Roman" w:hAnsi="Times New Roman" w:eastAsia="Times New Roman" w:cs="Times New Roman"/>
+          <w:b/>
+          <w:bCs/>
+        </w:rPr>
+        <w:t xml:space="preserve">Parche de seguridad:</w:t>
+      </w:r>
+      <w:r>
+        <w:rPr>
+          <w:rFonts w:ascii="Times New Roman" w:hAnsi="Times New Roman" w:eastAsia="Times New Roman" w:cs="Times New Roman"/>
+        </w:rPr>
+        <w:t xml:space="preserve"> </w:t>
+      </w:r>
+      <w:r>
+        <w:rPr>
+          <w:rFonts w:ascii="Times New Roman" w:hAnsi="Times New Roman" w:eastAsia="Times New Roman" w:cs="Times New Roman"/>
+        </w:rPr>
+        <w:t xml:space="preserve">{fichaParcheSeguridad}</w:t>
+      </w:r>
+    </w:p>
+    <w:p>
+      <w:pPr>
+        <w:numPr>
+          <w:ilvl w:val="0"/>
+          <w:numId w:val="4"/>
+        </w:numPr>
+        <w:spacing w:after="0" w:line="360" w:lineRule="auto"/>
+        <w:jc w:val="both"/>
+        <w:rPr>
+          <w:rFonts w:ascii="Times New Roman" w:hAnsi="Times New Roman" w:eastAsia="Times New Roman" w:cs="Times New Roman"/>
+        </w:rPr>
+      </w:pPr>
+      <w:r>
+        <w:rPr>
+          <w:rFonts w:ascii="Times New Roman" w:hAnsi="Times New Roman" w:eastAsia="Times New Roman" w:cs="Times New Roman"/>
+          <w:b/>
+          <w:bCs/>
+        </w:rPr>
+        <w:t xml:space="preserve">Número de serie:</w:t>
+      </w:r>
+      <w:r>
+        <w:rPr>
+          <w:rFonts w:ascii="Times New Roman" w:hAnsi="Times New Roman" w:eastAsia="Times New Roman" w:cs="Times New Roman"/>
+        </w:rPr>
+        <w:t xml:space="preserve"> </w:t>
+      </w:r>
+      <w:r>
+        <w:rPr>
+          <w:rFonts w:ascii="Times New Roman" w:hAnsi="Times New Roman" w:eastAsia="Times New Roman" w:cs="Times New Roman"/>
+        </w:rPr>
+        <w:t xml:space="preserve">{fichaNumeroSerie}</w:t>
+      </w:r>
+    </w:p>
+    <w:p>
+      <w:pPr>
+        <w:numPr>
+          <w:ilvl w:val="0"/>
+          <w:numId w:val="4"/>
+        </w:numPr>
+        <w:spacing w:after="0" w:line="360" w:lineRule="auto"/>
+        <w:jc w:val="both"/>
+        <w:rPr>
+          <w:rFonts w:ascii="Times New Roman" w:hAnsi="Times New Roman" w:eastAsia="Times New Roman" w:cs="Times New Roman"/>
+        </w:rPr>
+      </w:pPr>
+      <w:r>
+        <w:rPr>
+          <w:rFonts w:ascii="Times New Roman" w:hAnsi="Times New Roman" w:eastAsia="Times New Roman" w:cs="Times New Roman"/>
+          <w:b/>
+          <w:bCs/>
+        </w:rPr>
+        <w:t xml:space="preserve">Identificador de conexión:</w:t>
+      </w:r>
+      <w:r>
+        <w:rPr>
+          <w:rFonts w:ascii="Times New Roman" w:hAnsi="Times New Roman" w:eastAsia="Times New Roman" w:cs="Times New Roman"/>
+        </w:rPr>
+        <w:t xml:space="preserve"> </w:t>
+      </w:r>
+      <w:r>
+        <w:rPr>
+          <w:rFonts w:ascii="Times New Roman" w:hAnsi="Times New Roman" w:eastAsia="Times New Roman" w:cs="Times New Roman"/>
+        </w:rPr>
+        <w:t xml:space="preserve">{fichaIdentificadorConexion}</w:t>
+      </w:r>
+    </w:p>
+    <w:p>
+      <w:pPr>
+        <w:numPr>
+          <w:ilvl w:val="0"/>
+          <w:numId w:val="4"/>
+        </w:numPr>
+        <w:spacing w:after="0" w:line="360" w:lineRule="auto"/>
+        <w:jc w:val="both"/>
+        <w:rPr>
+          <w:rFonts w:ascii="Times New Roman" w:hAnsi="Times New Roman" w:eastAsia="Times New Roman" w:cs="Times New Roman"/>
+        </w:rPr>
+      </w:pPr>
+      <w:r>
+        <w:rPr>
+          <w:rFonts w:ascii="Times New Roman" w:hAnsi="Times New Roman" w:eastAsia="Times New Roman" w:cs="Times New Roman"/>
+          <w:b/>
+          <w:bCs/>
+        </w:rPr>
+        <w:t xml:space="preserve">Kernel:</w:t>
+      </w:r>
+      <w:r>
+        <w:rPr>
+          <w:rFonts w:ascii="Times New Roman" w:hAnsi="Times New Roman" w:eastAsia="Times New Roman" w:cs="Times New Roman"/>
+        </w:rPr>
+        <w:t xml:space="preserve"> </w:t>
+      </w:r>
+      <w:r>
+        <w:rPr>
+          <w:rFonts w:ascii="Times New Roman" w:hAnsi="Times New Roman" w:eastAsia="Times New Roman" w:cs="Times New Roman"/>
+        </w:rPr>
+        <w:t xml:space="preserve">{fichaKernel}</w:t>
+      </w:r>
+    </w:p>
+    <w:p>
+      <w:pPr>
+        <w:numPr>
+          <w:ilvl w:val="0"/>
+          <w:numId w:val="4"/>
+        </w:numPr>
+        <w:spacing w:after="0" w:line="360" w:lineRule="auto"/>
+        <w:jc w:val="both"/>
+        <w:rPr>
+          <w:rFonts w:ascii="Times New Roman" w:hAnsi="Times New Roman" w:eastAsia="Times New Roman" w:cs="Times New Roman"/>
+        </w:rPr>
+      </w:pPr>
+      <w:r>
+        <w:rPr>
+          <w:rFonts w:ascii="Times New Roman" w:hAnsi="Times New Roman" w:eastAsia="Times New Roman" w:cs="Times New Roman"/>
+          <w:b/>
+          <w:bCs/>
+        </w:rPr>
+        <w:t xml:space="preserve">Operador / SIM:</w:t>
+      </w:r>
+      <w:r>
+        <w:rPr>
+          <w:rFonts w:ascii="Times New Roman" w:hAnsi="Times New Roman" w:eastAsia="Times New Roman" w:cs="Times New Roman"/>
+        </w:rPr>
+        <w:t xml:space="preserve"> </w:t>
+      </w:r>
+      <w:r>
+        <w:rPr>
+          <w:rFonts w:ascii="Times New Roman" w:hAnsi="Times New Roman" w:eastAsia="Times New Roman" w:cs="Times New Roman"/>
+        </w:rPr>
+        <w:t xml:space="preserve">{fichaOperadorSim}</w:t>
+      </w:r>
+    </w:p>
+    <w:p>
+      <w:pPr>
+        <w:numPr>
+          <w:ilvl w:val="0"/>
+          <w:numId w:val="4"/>
+        </w:numPr>
+        <w:spacing w:after="0" w:line="360" w:lineRule="auto"/>
+        <w:jc w:val="both"/>
+        <w:rPr>
+          <w:rFonts w:ascii="Times New Roman" w:hAnsi="Times New Roman" w:eastAsia="Times New Roman" w:cs="Times New Roman"/>
+        </w:rPr>
+      </w:pPr>
+      <w:r>
+        <w:rPr>
+          <w:rFonts w:ascii="Times New Roman" w:hAnsi="Times New Roman" w:eastAsia="Times New Roman" w:cs="Times New Roman"/>
+          <w:b/>
+          <w:bCs/>
+        </w:rPr>
+        <w:t xml:space="preserve">Estado de arranque:</w:t>
+      </w:r>
+      <w:r>
+        <w:rPr>
+          <w:rFonts w:ascii="Times New Roman" w:hAnsi="Times New Roman" w:eastAsia="Times New Roman" w:cs="Times New Roman"/>
+        </w:rPr>
+        <w:t xml:space="preserve"> </w:t>
+      </w:r>
+      <w:r>
+        <w:rPr>
+          <w:rFonts w:ascii="Times New Roman" w:hAnsi="Times New Roman" w:eastAsia="Times New Roman" w:cs="Times New Roman"/>
+        </w:rPr>
+        <w:t xml:space="preserve">{fichaEstadoArranque}</w:t>
+      </w:r>
+    </w:p>
+    <w:p>
+      <w:pPr>
+        <w:numPr>
+          <w:ilvl w:val="0"/>
+          <w:numId w:val="4"/>
+        </w:numPr>
+        <w:spacing w:after="0" w:line="360" w:lineRule="auto"/>
+        <w:jc w:val="both"/>
+        <w:rPr>
+          <w:rFonts w:ascii="Times New Roman" w:hAnsi="Times New Roman" w:eastAsia="Times New Roman" w:cs="Times New Roman"/>
+        </w:rPr>
+      </w:pPr>
+      <w:r>
+        <w:rPr>
+          <w:rFonts w:ascii="Times New Roman" w:hAnsi="Times New Roman" w:eastAsia="Times New Roman" w:cs="Times New Roman"/>
+          <w:b/>
+          <w:bCs/>
+        </w:rPr>
+        <w:t xml:space="preserve">Zona horaria:</w:t>
+      </w:r>
+      <w:r>
+        <w:rPr>
+          <w:rFonts w:ascii="Times New Roman" w:hAnsi="Times New Roman" w:eastAsia="Times New Roman" w:cs="Times New Roman"/>
+        </w:rPr>
+        <w:t xml:space="preserve"> </w:t>
+      </w:r>
+      <w:r>
+        <w:rPr>
+          <w:rFonts w:ascii="Times New Roman" w:hAnsi="Times New Roman" w:eastAsia="Times New Roman" w:cs="Times New Roman"/>
+        </w:rPr>
+        <w:t xml:space="preserve">{fichaZonaHoraria}</w:t>
+      </w:r>
+    </w:p>
+    <w:p>
+      <w:pPr>
+        <w:numPr>
+          <w:ilvl w:val="0"/>
+          <w:numId w:val="4"/>
+        </w:numPr>
+        <w:spacing w:after="0" w:line="360" w:lineRule="auto"/>
+        <w:jc w:val="both"/>
+        <w:rPr>
+          <w:rFonts w:ascii="Times New Roman" w:hAnsi="Times New Roman" w:eastAsia="Times New Roman" w:cs="Times New Roman"/>
+        </w:rPr>
+      </w:pPr>
+      <w:r>
+        <w:rPr>
+          <w:rFonts w:ascii="Times New Roman" w:hAnsi="Times New Roman" w:eastAsia="Times New Roman" w:cs="Times New Roman"/>
+          <w:b/>
+          <w:bCs/>
+        </w:rPr>
+        <w:t xml:space="preserve">Wifi:</w:t>
+      </w:r>
+      <w:r>
+        <w:rPr>
+          <w:rFonts w:ascii="Times New Roman" w:hAnsi="Times New Roman" w:eastAsia="Times New Roman" w:cs="Times New Roman"/>
+        </w:rPr>
+        <w:t xml:space="preserve"> </w:t>
+      </w:r>
+      <w:r>
+        <w:rPr>
+          <w:rFonts w:ascii="Times New Roman" w:hAnsi="Times New Roman" w:eastAsia="Times New Roman" w:cs="Times New Roman"/>
+        </w:rPr>
+        <w:t xml:space="preserve">{fichaWifi}</w:t>
+      </w:r>
+    </w:p>
+    <w:p>
+      <w:pPr>
+        <w:spacing w:after="0" w:line="360" w:lineRule="auto"/>
+        <w:ind w:firstLine="2268"/>
+        <w:jc w:val="both"/>
+        <w:rPr>
+          <w:rFonts w:hint="default" w:ascii="Times New Roman" w:hAnsi="Times New Roman" w:eastAsia="Times New Roman" w:cs="Times New Roman"/>
+          <w:kern w:val="0"/>
+          <w:lang w:val="en-US"/>
+          <w14:ligatures w14:val="none"/>
+        </w:rPr>
+      </w:pPr>
+      <w:r>
+        <w:rPr>
+          <w:rFonts w:ascii="Times New Roman" w:hAnsi="Times New Roman" w:eastAsia="Times New Roman" w:cs="Times New Roman"/>
+        </w:rPr>
+        <w:t xml:space="preserve">{descripcionRelojDispositivo}</w:t>
+      </w:r>
+    </w:p>
+    <w:p>
+      <w:pPr>
+        <w:spacing w:after="0" w:line="240" w:lineRule="auto"/>
+        <w:rPr>
+          <w:rFonts w:ascii="Times New Roman" w:hAnsi="Times New Roman" w:eastAsia="Times New Roman" w:cs="Times New Roman"/>
+        </w:rPr>
+      </w:pPr>
+      <w:r>
+        <w:rPr>
+          <w:rFonts w:ascii="Times New Roman" w:hAnsi="Times New Roman" w:eastAsia="Times New Roman" w:cs="Times New Roman"/>
+        </w:rPr>
+        <w:t>{/fichaTecnica}</w:t>
       </w:r>
     </w:p>
     <w:p>

</xml_diff>